<commit_message>
Render v0.6.1 Rulebook and Reference Guide
</commit_message>
<xml_diff>
--- a/releases/v0.6.1/Gauntlet_v0.6.1_Rulebook.docx
+++ b/releases/v0.6.1/Gauntlet_v0.6.1_Rulebook.docx
@@ -31,58 +31,186 @@
             <w:pStyle w:val="TOCHeading"/>
           </w:pPr>
           <w:r>
-            <w:t xml:space="preserve">Table of Contents</w:t>
+            <w:t>Table of Contents</w:t>
           </w:r>
         </w:p>
         <w:p>
+          <w:pPr>
+            <w:pStyle w:val="TOC1"/>
+          </w:pPr>
+          <w:hyperlink w:anchor="welcome-to-gauntlet" w:history="1">
+            <w:r>
+              <w:t>Welcome to Gauntlet</w:t>
+            </w:r>
+          </w:hyperlink>
+        </w:p>
+        <w:p>
+          <w:pPr>
+            <w:pStyle w:val="TOC1"/>
+          </w:pPr>
+          <w:hyperlink w:anchor="rules-conventions" w:history="1">
+            <w:r>
+              <w:t>Rules Conventions</w:t>
+            </w:r>
+          </w:hyperlink>
+        </w:p>
+        <w:p>
+          <w:pPr>
+            <w:pStyle w:val="TOC1"/>
+          </w:pPr>
+          <w:hyperlink w:anchor="Xe6969fd164a6f33c26a9e2eb2b57daca386239a" w:history="1">
+            <w:r>
+              <w:t>1. Components</w:t>
+            </w:r>
+          </w:hyperlink>
+        </w:p>
+        <w:p>
+          <w:pPr>
+            <w:pStyle w:val="TOC1"/>
+          </w:pPr>
+          <w:hyperlink w:anchor="X1aa3bb996543939ab9f48144152010207c5cc31" w:history="1">
+            <w:r>
+              <w:t>2. Building a Deck</w:t>
+            </w:r>
+          </w:hyperlink>
+        </w:p>
+        <w:p>
+          <w:pPr>
+            <w:pStyle w:val="TOC1"/>
+          </w:pPr>
+          <w:hyperlink w:anchor="Xaf720dab6e1a6fe367187d817bf580bba6dcd9c" w:history="1">
+            <w:r>
+              <w:t>3. Setup</w:t>
+            </w:r>
+          </w:hyperlink>
+        </w:p>
+        <w:p>
+          <w:pPr>
+            <w:pStyle w:val="TOC1"/>
+          </w:pPr>
+          <w:hyperlink w:anchor="Xcec637542a4c2dcf3e013ed48ad56347297d6d4" w:history="1">
+            <w:r>
+              <w:t>4. Turn Structure</w:t>
+            </w:r>
+          </w:hyperlink>
+        </w:p>
+        <w:p>
+          <w:pPr>
+            <w:pStyle w:val="TOC1"/>
+          </w:pPr>
+          <w:hyperlink w:anchor="X4a95ab6fdfb1df1521a818d1cd5383953a931cf" w:history="1">
+            <w:r>
+              <w:t>5. Movement</w:t>
+            </w:r>
+          </w:hyperlink>
+        </w:p>
+        <w:p>
+          <w:pPr>
+            <w:pStyle w:val="TOC1"/>
+          </w:pPr>
+          <w:hyperlink w:anchor="X97f327af27f5788a02b0239f1d64e07514976bc" w:history="1">
+            <w:r>
+              <w:t>6. Battles</w:t>
+            </w:r>
+          </w:hyperlink>
+        </w:p>
+        <w:p>
+          <w:pPr>
+            <w:pStyle w:val="TOC1"/>
+          </w:pPr>
+          <w:hyperlink w:anchor="X57131c29fabc34ac98968a4f9b49ad1b784c193" w:history="1">
+            <w:r>
+              <w:t>7. The Aftermath of the Battle</w:t>
+            </w:r>
+          </w:hyperlink>
+        </w:p>
+        <w:p>
+          <w:pPr>
+            <w:pStyle w:val="TOC1"/>
+          </w:pPr>
+          <w:hyperlink w:anchor="X4116aedc66c2276374cc4eb44ea0fce9ee3fe2c" w:history="1">
+            <w:r>
+              <w:t>8. Withdrawal and Retreat</w:t>
+            </w:r>
+          </w:hyperlink>
+        </w:p>
+        <w:p>
+          <w:pPr>
+            <w:pStyle w:val="TOC1"/>
+          </w:pPr>
+          <w:hyperlink w:anchor="X6ef091375c384855740e41fbb473d4ff8c8847b" w:history="1">
+            <w:r>
+              <w:t>9. Territory Control</w:t>
+            </w:r>
+          </w:hyperlink>
+        </w:p>
+        <w:p>
+          <w:pPr>
+            <w:pStyle w:val="TOC1"/>
+          </w:pPr>
+          <w:hyperlink w:anchor="Xb13108c5ec8c41147f7a9a7cce3eb1fa4966d96" w:history="1">
+            <w:r>
+              <w:t>10. Running the Gauntlet</w:t>
+            </w:r>
+          </w:hyperlink>
+        </w:p>
+        <w:p>
+          <w:pPr>
+            <w:pStyle w:val="TOC1"/>
+          </w:pPr>
+          <w:hyperlink w:anchor="X10ef377f1c120093942fb19b10282922c933cce" w:history="1">
+            <w:r>
+              <w:t>11. Game Zones</w:t>
+            </w:r>
+          </w:hyperlink>
+        </w:p>
+        <w:p>
+          <w:pPr>
+            <w:pStyle w:val="TOC1"/>
+          </w:pPr>
+          <w:hyperlink w:anchor="X24182d789e636cee7a803fba436229ee8aa20b9" w:history="1">
+            <w:r>
+              <w:t>12. Actions and Assets</w:t>
+            </w:r>
+          </w:hyperlink>
+        </w:p>
+        <w:p>
+          <w:pPr>
+            <w:pStyle w:val="TOC1"/>
+          </w:pPr>
+          <w:hyperlink w:anchor="Xbae481e71bb23d9788fd20196d83d8cfb4ca8fa" w:history="1">
+            <w:r>
+              <w:t>13. Overlays</w:t>
+            </w:r>
+          </w:hyperlink>
+        </w:p>
+        <w:p>
+          <w:pPr>
+            <w:pStyle w:val="TOC1"/>
+          </w:pPr>
+          <w:hyperlink w:anchor="X4c5802a96a51a98b86b60169ea7a7b771909ed0" w:history="1">
+            <w:r>
+              <w:t>14. Factions</w:t>
+            </w:r>
+          </w:hyperlink>
+        </w:p>
+        <w:p>
+          <w:pPr>
+            <w:pStyle w:val="TOC1"/>
+          </w:pPr>
+          <w:hyperlink w:anchor="Xa967c9255868c3e1f516fb8c6d9948a6ca5aa46" w:history="1">
+            <w:r>
+              <w:t>15. Standard Language and Reference Rules</w:t>
+            </w:r>
+          </w:hyperlink>
+        </w:p>
+        <w:p>
           <w:r>
-            <w:fldChar w:fldCharType="begin" w:dirty="true"/>
-            <w:instrText xml:space="preserve">TOC \o "1-2" \h \z \u</w:instrText>
-            <w:fldChar w:fldCharType="separate"/>
-            <w:fldChar w:fldCharType="end"/>
+            <w:br w:type="page"/>
           </w:r>
         </w:p>
       </w:sdtContent>
     </w:sdt>
-    <w:bookmarkStart w:id="21" w:name="gauntlet"/>
-    <w:p>
-      <w:pPr>
-        <w:pStyle w:val="Heading1"/>
-      </w:pPr>
-      <w:r>
-        <w:t xml:space="preserve">GAUNTLET</w:t>
-      </w:r>
-    </w:p>
-    <w:bookmarkStart w:id="20" w:name="official-rulebook"/>
-    <w:p>
-      <w:pPr>
-        <w:pStyle w:val="Heading2"/>
-      </w:pPr>
-      <w:r>
-        <w:t xml:space="preserve">Official Rulebook</w:t>
-      </w:r>
-    </w:p>
-    <w:p>
-      <w:pPr>
-        <w:pStyle w:val="FirstParagraph"/>
-      </w:pPr>
-      <w:r>
-        <w:rPr>
-          <w:bCs/>
-          <w:b/>
-        </w:rPr>
-        <w:t xml:space="preserve">Version 0.6.1 — First Playtest Revision</w:t>
-      </w:r>
-    </w:p>
-    <w:p>
-      <w:r>
-        <w:pict>
-          <v:rect style="width:0;height:1.5pt" o:hralign="center" o:hrstd="t" o:hr="t"/>
-        </w:pict>
-      </w:r>
-    </w:p>
-    <w:bookmarkEnd w:id="20"/>
-    <w:bookmarkEnd w:id="21"/>
     <w:bookmarkStart w:id="22" w:name="welcome-to-gauntlet"/>
     <w:p>
       <w:pPr>

</xml_diff>

<commit_message>
Clarify v0.6.1 Defender's Advantage
</commit_message>
<xml_diff>
--- a/releases/v0.6.1/Gauntlet_v0.6.1_Rulebook.docx
+++ b/releases/v0.6.1/Gauntlet_v0.6.1_Rulebook.docx
@@ -2729,7 +2729,7 @@
         <w:t xml:space="preserve">Tactic</w:t>
       </w:r>
       <w:r>
-        <w:t xml:space="preserve">. Reveal Tactics, resolve the card effects, and roll dice. The higher battle total wins.</w:t>
+        <w:t xml:space="preserve">. Reveal Tactics, resolve the card effects, and roll dice. The higher battle total wins. If the totals are tied while the defender controls the contested Territory, Defender's Advantage means the defender wins the tie. Defender's Advantage is a tie rule, not the ordinary advantage mechanic that changes how dice are rolled.</w:t>
       </w:r>
     </w:p>
     <w:bookmarkEnd w:id="62"/>
@@ -3308,7 +3308,7 @@
         <w:t xml:space="preserve"> </w:t>
       </w:r>
       <w:r>
-        <w:t xml:space="preserve">If battle totals are tied and the defender controls the contested Territory, the defender wins. The defender also has Defender's Advantage during a Last Stand battle.</w:t>
+        <w:t xml:space="preserve">This is a tie rule, not an instance of the ordinary advantage mechanic. If battle totals are tied and the defender controls the contested Territory, the defender wins. Defender's Advantage does not grant an additional die. It also applies during a Last Stand battle, so the defender wins tied Last Stand battle totals even though no Territory is contested there.</w:t>
       </w:r>
     </w:p>
     <w:p>
@@ -4679,7 +4679,7 @@
         <w:pStyle w:val="BodyText"/>
       </w:pPr>
       <w:r>
-        <w:t xml:space="preserve">The defender is harder to defeat in a Last Stand: they receive Defender's Advantage and +1 to their battle total.</w:t>
+        <w:t xml:space="preserve">The defender is harder to defeat in a Last Stand: Defender's Advantage means they win tied battle totals, and they separately add +1 to their battle total.</w:t>
       </w:r>
     </w:p>
     <w:bookmarkEnd w:id="100"/>
@@ -4760,7 +4760,7 @@
         <w:pStyle w:val="Compact"/>
       </w:pPr>
       <w:r>
-        <w:t xml:space="preserve">the defender has Defender's Advantage; and</w:t>
+        <w:t xml:space="preserve">Defender's Advantage applies, so the defender wins tied battle totals; and</w:t>
       </w:r>
     </w:p>
     <w:p>
@@ -4772,7 +4772,7 @@
         <w:pStyle w:val="Compact"/>
       </w:pPr>
       <w:r>
-        <w:t xml:space="preserve">the defender adds +1 to their battle total.</w:t>
+        <w:t xml:space="preserve">the defender separately adds +1 to their battle total.</w:t>
       </w:r>
     </w:p>
     <w:p>

</xml_diff>